<commit_message>
Report: total RunPod cost ($3.72), last placeholder filled
From the RunPod billing page: $3.66 GPU time + $0.06 storage, all on
3 October 2026. Final_Report.docx rebuilt; no placeholders remain.

Co-Authored-By: Claude Opus 5.5 <noreply@anthropic.com>
</commit_message>
<xml_diff>
--- a/docs/Final_Report.docx
+++ b/docs/Final_Report.docx
@@ -495,7 +495,7 @@
             <w:pPr>
               <w:spacing w:after="0" w:before="0"/>
             </w:pPr>
-            <w:hyperlink w:history="1" r:id="rId0rb33ql8ordiugwvw_g3e">
+            <w:hyperlink w:history="1" r:id="rIdumrpoodouldxgv-9lifmi">
               <w:r>
                 <w:rPr>
                   <w:rStyle w:val="Hyperlink"/>
@@ -561,7 +561,7 @@
             <w:pPr>
               <w:spacing w:after="0" w:before="0"/>
             </w:pPr>
-            <w:hyperlink w:history="1" r:id="rIdok_ii8kksw5zojfe72uaw">
+            <w:hyperlink w:history="1" r:id="rIdrbxx5lkq5zx49kgj2natd">
               <w:r>
                 <w:rPr>
                   <w:rStyle w:val="Hyperlink"/>
@@ -2073,7 +2073,7 @@
             <w:pPr>
               <w:spacing w:after="0" w:before="0"/>
             </w:pPr>
-            <w:hyperlink w:history="1" r:id="rIdeqpwf1ms_vnwrytyvzpip">
+            <w:hyperlink w:history="1" r:id="rId-wgzoevbqneqm1kwciyvj">
               <w:r>
                 <w:rPr>
                   <w:rStyle w:val="Hyperlink"/>
@@ -2197,7 +2197,7 @@
             <w:pPr>
               <w:spacing w:after="0" w:before="0"/>
             </w:pPr>
-            <w:hyperlink w:history="1" r:id="rIdxakak80h1rtxx0vznx2oy">
+            <w:hyperlink w:history="1" r:id="rId1k4qdfunpxvsnp_difmu1">
               <w:r>
                 <w:rPr>
                   <w:rStyle w:val="Hyperlink"/>
@@ -2321,7 +2321,7 @@
             <w:pPr>
               <w:spacing w:after="0" w:before="0"/>
             </w:pPr>
-            <w:hyperlink w:history="1" r:id="rIds9xhig09r02cnly6-1gzh">
+            <w:hyperlink w:history="1" r:id="rId20-ukqdufkavqcxhg-pmv">
               <w:r>
                 <w:rPr>
                   <w:rStyle w:val="Hyperlink"/>
@@ -5602,7 +5602,7 @@
                 <w:sz w:val="19"/>
                 <w:szCs w:val="19"/>
               </w:rPr>
-              <w:t xml:space="preserve">Total GPU cost</w:t>
+              <w:t xml:space="preserve">Total cloud cost</w:t>
             </w:r>
           </w:p>
         </w:tc>
@@ -5630,9 +5630,8 @@
               <w:rPr>
                 <w:sz w:val="19"/>
                 <w:szCs w:val="19"/>
-                <w:highlight w:val="yellow"/>
-              </w:rPr>
-              <w:t xml:space="preserve">[about $X, from the RunPod billing page]</w:t>
+              </w:rPr>
+              <w:t xml:space="preserve">US$3.72 for the whole project on RunPod ($3.66 GPU time + $0.06 storage, 3 October 2026, from the RunPod billing page)</w:t>
             </w:r>
           </w:p>
         </w:tc>

</xml_diff>